<commit_message>
Update GreenWave Project Phase B 24-1-D-2.docx
</commit_message>
<xml_diff>
--- a/GreenWave Project Phase B 24-1-D-2.docx
+++ b/GreenWave Project Phase B 24-1-D-2.docx
@@ -28,12 +28,12 @@
             <wp:extent cx="2524125" cy="600075"/>
             <wp:effectExtent b="0" l="0" r="0" t="0"/>
             <wp:wrapNone/>
-            <wp:docPr id="17" name="image6.png"/>
+            <wp:docPr id="17" name="image4.png"/>
             <a:graphic>
               <a:graphicData uri="http://schemas.openxmlformats.org/drawingml/2006/picture">
                 <pic:pic>
                   <pic:nvPicPr>
-                    <pic:cNvPr id="0" name="image6.png"/>
+                    <pic:cNvPr id="0" name="image4.png"/>
                     <pic:cNvPicPr preferRelativeResize="0"/>
                   </pic:nvPicPr>
                   <pic:blipFill>
@@ -912,12 +912,12 @@
             <wp:extent cx="5720039" cy="2557463"/>
             <wp:effectExtent b="0" l="0" r="0" t="0"/>
             <wp:wrapNone/>
-            <wp:docPr id="10" name="image17.jpg"/>
+            <wp:docPr id="10" name="image9.jpg"/>
             <a:graphic>
               <a:graphicData uri="http://schemas.openxmlformats.org/drawingml/2006/picture">
                 <pic:pic>
                   <pic:nvPicPr>
-                    <pic:cNvPr id="0" name="image17.jpg"/>
+                    <pic:cNvPr id="0" name="image9.jpg"/>
                     <pic:cNvPicPr preferRelativeResize="0"/>
                   </pic:nvPicPr>
                   <pic:blipFill>
@@ -3450,6 +3450,101 @@
           <w:rtl w:val="0"/>
         </w:rPr>
         <w:t xml:space="preserve">All steps are the same as Min Energy, except that each vehicle's get_pollution_to_velocity(…) replaces their energy calculation. This allows the system to continue trading delay versus environmental impact.</w:t>
+      </w:r>
+    </w:p>
+    <w:p>
+      <w:pPr>
+        <w:ind w:left="0" w:firstLine="0"/>
+        <w:rPr>
+          <w:sz w:val="24"/>
+          <w:szCs w:val="24"/>
+        </w:rPr>
+      </w:pPr>
+      <w:r>
+        <w:rPr>
+          <w:rtl w:val="0"/>
+        </w:rPr>
+      </w:r>
+    </w:p>
+    <w:p>
+      <w:pPr>
+        <w:ind w:left="0" w:firstLine="0"/>
+        <w:rPr>
+          <w:sz w:val="24"/>
+          <w:szCs w:val="24"/>
+        </w:rPr>
+      </w:pPr>
+      <w:r>
+        <w:rPr>
+          <w:rtl w:val="0"/>
+        </w:rPr>
+      </w:r>
+    </w:p>
+    <w:p>
+      <w:pPr>
+        <w:ind w:left="0" w:firstLine="0"/>
+        <w:rPr>
+          <w:sz w:val="24"/>
+          <w:szCs w:val="24"/>
+        </w:rPr>
+      </w:pPr>
+      <w:r>
+        <w:rPr>
+          <w:sz w:val="24"/>
+          <w:szCs w:val="24"/>
+          <w:rtl w:val="0"/>
+        </w:rPr>
+        <w:t xml:space="preserve">In order to create a functioning simulation with the demands we faced, we had to write a custom engine which handles all the back-end and front-end logic and display. The </w:t>
+      </w:r>
+      <w:r>
+        <w:rPr>
+          <w:sz w:val="24"/>
+          <w:szCs w:val="24"/>
+          <w:rtl w:val="0"/>
+        </w:rPr>
+        <w:t xml:space="preserve">simulation.py</w:t>
+      </w:r>
+      <w:r>
+        <w:rPr>
+          <w:sz w:val="24"/>
+          <w:szCs w:val="24"/>
+          <w:rtl w:val="0"/>
+        </w:rPr>
+        <w:t xml:space="preserve"> file is responsible for this functionality, by creating a custom graph from a json file, running the algorithms, changing screens, drawing relevant objects on the screen and etc.</w:t>
+      </w:r>
+    </w:p>
+    <w:p>
+      <w:pPr>
+        <w:ind w:left="0" w:firstLine="0"/>
+        <w:rPr>
+          <w:sz w:val="24"/>
+          <w:szCs w:val="24"/>
+        </w:rPr>
+      </w:pPr>
+      <w:r>
+        <w:rPr>
+          <w:sz w:val="24"/>
+          <w:szCs w:val="24"/>
+          <w:rtl w:val="0"/>
+        </w:rPr>
+        <w:t xml:space="preserve">Each of the following algorithms run as a thread in our simulation screen. One algorithm thread for the displayed graph and one for the “backstage” compare-to graph. Both graphs are identical (same cars, junctions, cars paths, etc) so the difference in the upcoming statistics dashboard is measured only by the difference between the algorithms.</w:t>
+      </w:r>
+    </w:p>
+    <w:p>
+      <w:pPr>
+        <w:ind w:left="0" w:firstLine="0"/>
+        <w:rPr>
+          <w:sz w:val="24"/>
+          <w:szCs w:val="24"/>
+        </w:rPr>
+      </w:pPr>
+      <w:r>
+        <w:rPr>
+          <w:sz w:val="24"/>
+          <w:szCs w:val="24"/>
+          <w:rtl w:val="0"/>
+        </w:rPr>
+        <w:t xml:space="preserve">Each algorithm thread runs a thread per junction which controls the junction’s state change.</w:t>
       </w:r>
     </w:p>
     <w:p>
@@ -6427,7 +6522,7 @@
           <w:szCs w:val="24"/>
           <w:rtl w:val="0"/>
         </w:rPr>
-        <w:t xml:space="preserve">The GreenWave Traffic-Light Simulator is intended to allow users to load any JSON-defined road network and compare several signal-control strategies in real time. It was developed in Python 3.8+ with Pygame to support the interactive GUI. The software reads map files using the standard json module, spawns control threads in parallel using threading, and models vehicle dynamics with custom Junction, Direction, Lane, and Vehicle classes.</w:t>
+        <w:t xml:space="preserve">The GreenWave Traffic-Light Simulator is intended to allow users to load any JSON-defined road network and compare several signal-control strategies in real time. It was developed in Python 3.10+ with Pygame to support the interactive GUI. The software reads map files using the standard json module, spawns control threads in parallel using threading, and models vehicle dynamics with custom Junction, Direction, Lane, and Vehicle classes.</w:t>
       </w:r>
     </w:p>
     <w:p>
@@ -6503,12 +6598,12 @@
           <wp:inline distB="114300" distT="114300" distL="114300" distR="114300">
             <wp:extent cx="5731200" cy="3289300"/>
             <wp:effectExtent b="0" l="0" r="0" t="0"/>
-            <wp:docPr id="13" name="image4.jpg"/>
+            <wp:docPr id="13" name="image11.jpg"/>
             <a:graphic>
               <a:graphicData uri="http://schemas.openxmlformats.org/drawingml/2006/picture">
                 <pic:pic>
                   <pic:nvPicPr>
-                    <pic:cNvPr id="0" name="image4.jpg"/>
+                    <pic:cNvPr id="0" name="image11.jpg"/>
                     <pic:cNvPicPr preferRelativeResize="0"/>
                   </pic:nvPicPr>
                   <pic:blipFill>
@@ -6771,12 +6866,12 @@
           <wp:inline distB="114300" distT="114300" distL="114300" distR="114300">
             <wp:extent cx="5731200" cy="3289300"/>
             <wp:effectExtent b="0" l="0" r="0" t="0"/>
-            <wp:docPr id="7" name="image19.jpg"/>
+            <wp:docPr id="7" name="image10.jpg"/>
             <a:graphic>
               <a:graphicData uri="http://schemas.openxmlformats.org/drawingml/2006/picture">
                 <pic:pic>
                   <pic:nvPicPr>
-                    <pic:cNvPr id="0" name="image19.jpg"/>
+                    <pic:cNvPr id="0" name="image10.jpg"/>
                     <pic:cNvPicPr preferRelativeResize="0"/>
                   </pic:nvPicPr>
                   <pic:blipFill>
@@ -7144,12 +7239,12 @@
           <wp:inline distB="114300" distT="114300" distL="114300" distR="114300">
             <wp:extent cx="5731200" cy="3276600"/>
             <wp:effectExtent b="0" l="0" r="0" t="0"/>
-            <wp:docPr id="1" name="image10.jpg"/>
+            <wp:docPr id="1" name="image6.jpg"/>
             <a:graphic>
               <a:graphicData uri="http://schemas.openxmlformats.org/drawingml/2006/picture">
                 <pic:pic>
                   <pic:nvPicPr>
-                    <pic:cNvPr id="0" name="image10.jpg"/>
+                    <pic:cNvPr id="0" name="image6.jpg"/>
                     <pic:cNvPicPr preferRelativeResize="0"/>
                   </pic:nvPicPr>
                   <pic:blipFill>
@@ -7380,12 +7475,12 @@
           <wp:inline distB="114300" distT="114300" distL="114300" distR="114300">
             <wp:extent cx="5731200" cy="3060700"/>
             <wp:effectExtent b="0" l="0" r="0" t="0"/>
-            <wp:docPr id="16" name="image14.png"/>
+            <wp:docPr id="16" name="image15.png"/>
             <a:graphic>
               <a:graphicData uri="http://schemas.openxmlformats.org/drawingml/2006/picture">
                 <pic:pic>
                   <pic:nvPicPr>
-                    <pic:cNvPr id="0" name="image14.png"/>
+                    <pic:cNvPr id="0" name="image15.png"/>
                     <pic:cNvPicPr preferRelativeResize="0"/>
                   </pic:nvPicPr>
                   <pic:blipFill>
@@ -7463,12 +7558,12 @@
           <wp:inline distB="114300" distT="114300" distL="114300" distR="114300">
             <wp:extent cx="5731200" cy="3276600"/>
             <wp:effectExtent b="0" l="0" r="0" t="0"/>
-            <wp:docPr id="6" name="image15.png"/>
+            <wp:docPr id="6" name="image19.png"/>
             <a:graphic>
               <a:graphicData uri="http://schemas.openxmlformats.org/drawingml/2006/picture">
                 <pic:pic>
                   <pic:nvPicPr>
-                    <pic:cNvPr id="0" name="image15.png"/>
+                    <pic:cNvPr id="0" name="image19.png"/>
                     <pic:cNvPicPr preferRelativeResize="0"/>
                   </pic:nvPicPr>
                   <pic:blipFill>
@@ -7588,12 +7683,12 @@
           <wp:inline distB="114300" distT="114300" distL="114300" distR="114300">
             <wp:extent cx="5731200" cy="3276600"/>
             <wp:effectExtent b="0" l="0" r="0" t="0"/>
-            <wp:docPr id="15" name="image16.png"/>
+            <wp:docPr id="15" name="image8.png"/>
             <a:graphic>
               <a:graphicData uri="http://schemas.openxmlformats.org/drawingml/2006/picture">
                 <pic:pic>
                   <pic:nvPicPr>
-                    <pic:cNvPr id="0" name="image16.png"/>
+                    <pic:cNvPr id="0" name="image8.png"/>
                     <pic:cNvPicPr preferRelativeResize="0"/>
                   </pic:nvPicPr>
                   <pic:blipFill>
@@ -7671,12 +7766,12 @@
           <wp:inline distB="114300" distT="114300" distL="114300" distR="114300">
             <wp:extent cx="5731200" cy="3276600"/>
             <wp:effectExtent b="0" l="0" r="0" t="0"/>
-            <wp:docPr id="3" name="image18.png"/>
+            <wp:docPr id="3" name="image17.png"/>
             <a:graphic>
               <a:graphicData uri="http://schemas.openxmlformats.org/drawingml/2006/picture">
                 <pic:pic>
                   <pic:nvPicPr>
-                    <pic:cNvPr id="0" name="image18.png"/>
+                    <pic:cNvPr id="0" name="image17.png"/>
                     <pic:cNvPicPr preferRelativeResize="0"/>
                   </pic:nvPicPr>
                   <pic:blipFill>
@@ -7824,12 +7919,12 @@
           <wp:inline distB="114300" distT="114300" distL="114300" distR="114300">
             <wp:extent cx="5731200" cy="3276600"/>
             <wp:effectExtent b="0" l="0" r="0" t="0"/>
-            <wp:docPr id="18" name="image2.png"/>
+            <wp:docPr id="18" name="image1.png"/>
             <a:graphic>
               <a:graphicData uri="http://schemas.openxmlformats.org/drawingml/2006/picture">
                 <pic:pic>
                   <pic:nvPicPr>
-                    <pic:cNvPr id="0" name="image2.png"/>
+                    <pic:cNvPr id="0" name="image1.png"/>
                     <pic:cNvPicPr preferRelativeResize="0"/>
                   </pic:nvPicPr>
                   <pic:blipFill>
@@ -7893,12 +7988,12 @@
           <wp:inline distB="114300" distT="114300" distL="114300" distR="114300">
             <wp:extent cx="5731200" cy="3263900"/>
             <wp:effectExtent b="0" l="0" r="0" t="0"/>
-            <wp:docPr id="8" name="image7.png"/>
+            <wp:docPr id="8" name="image12.png"/>
             <a:graphic>
               <a:graphicData uri="http://schemas.openxmlformats.org/drawingml/2006/picture">
                 <pic:pic>
                   <pic:nvPicPr>
-                    <pic:cNvPr id="0" name="image7.png"/>
+                    <pic:cNvPr id="0" name="image12.png"/>
                     <pic:cNvPicPr preferRelativeResize="0"/>
                   </pic:nvPicPr>
                   <pic:blipFill>
@@ -8088,12 +8183,12 @@
           <wp:inline distB="114300" distT="114300" distL="114300" distR="114300">
             <wp:extent cx="5731200" cy="3302000"/>
             <wp:effectExtent b="0" l="0" r="0" t="0"/>
-            <wp:docPr id="19" name="image9.jpg"/>
+            <wp:docPr id="19" name="image18.jpg"/>
             <a:graphic>
               <a:graphicData uri="http://schemas.openxmlformats.org/drawingml/2006/picture">
                 <pic:pic>
                   <pic:nvPicPr>
-                    <pic:cNvPr id="0" name="image9.jpg"/>
+                    <pic:cNvPr id="0" name="image18.jpg"/>
                     <pic:cNvPicPr preferRelativeResize="0"/>
                   </pic:nvPicPr>
                   <pic:blipFill>
@@ -8171,12 +8266,12 @@
           <wp:inline distB="114300" distT="114300" distL="114300" distR="114300">
             <wp:extent cx="5731200" cy="3302000"/>
             <wp:effectExtent b="0" l="0" r="0" t="0"/>
-            <wp:docPr id="14" name="image1.png"/>
+            <wp:docPr id="14" name="image2.png"/>
             <a:graphic>
               <a:graphicData uri="http://schemas.openxmlformats.org/drawingml/2006/picture">
                 <pic:pic>
                   <pic:nvPicPr>
-                    <pic:cNvPr id="0" name="image1.png"/>
+                    <pic:cNvPr id="0" name="image2.png"/>
                     <pic:cNvPicPr preferRelativeResize="0"/>
                   </pic:nvPicPr>
                   <pic:blipFill>
@@ -8324,12 +8419,12 @@
           <wp:inline distB="114300" distT="114300" distL="114300" distR="114300">
             <wp:extent cx="5731200" cy="3365500"/>
             <wp:effectExtent b="0" l="0" r="0" t="0"/>
-            <wp:docPr id="12" name="image3.png"/>
+            <wp:docPr id="12" name="image7.png"/>
             <a:graphic>
               <a:graphicData uri="http://schemas.openxmlformats.org/drawingml/2006/picture">
                 <pic:pic>
                   <pic:nvPicPr>
-                    <pic:cNvPr id="0" name="image3.png"/>
+                    <pic:cNvPr id="0" name="image7.png"/>
                     <pic:cNvPicPr preferRelativeResize="0"/>
                   </pic:nvPicPr>
                   <pic:blipFill>
@@ -8393,12 +8488,12 @@
           <wp:inline distB="114300" distT="114300" distL="114300" distR="114300">
             <wp:extent cx="5731200" cy="3276600"/>
             <wp:effectExtent b="0" l="0" r="0" t="0"/>
-            <wp:docPr id="2" name="image11.png"/>
+            <wp:docPr id="2" name="image3.png"/>
             <a:graphic>
               <a:graphicData uri="http://schemas.openxmlformats.org/drawingml/2006/picture">
                 <pic:pic>
                   <pic:nvPicPr>
-                    <pic:cNvPr id="0" name="image11.png"/>
+                    <pic:cNvPr id="0" name="image3.png"/>
                     <pic:cNvPicPr preferRelativeResize="0"/>
                   </pic:nvPicPr>
                   <pic:blipFill>
@@ -8574,12 +8669,12 @@
           <wp:inline distB="114300" distT="114300" distL="114300" distR="114300">
             <wp:extent cx="5731200" cy="3289300"/>
             <wp:effectExtent b="0" l="0" r="0" t="0"/>
-            <wp:docPr id="11" name="image5.png"/>
+            <wp:docPr id="11" name="image16.png"/>
             <a:graphic>
               <a:graphicData uri="http://schemas.openxmlformats.org/drawingml/2006/picture">
                 <pic:pic>
                   <pic:nvPicPr>
-                    <pic:cNvPr id="0" name="image5.png"/>
+                    <pic:cNvPr id="0" name="image16.png"/>
                     <pic:cNvPicPr preferRelativeResize="0"/>
                   </pic:nvPicPr>
                   <pic:blipFill>
@@ -8671,12 +8766,12 @@
           <wp:inline distB="114300" distT="114300" distL="114300" distR="114300">
             <wp:extent cx="5731200" cy="3276600"/>
             <wp:effectExtent b="0" l="0" r="0" t="0"/>
-            <wp:docPr id="4" name="image8.png"/>
+            <wp:docPr id="4" name="image14.png"/>
             <a:graphic>
               <a:graphicData uri="http://schemas.openxmlformats.org/drawingml/2006/picture">
                 <pic:pic>
                   <pic:nvPicPr>
-                    <pic:cNvPr id="0" name="image8.png"/>
+                    <pic:cNvPr id="0" name="image14.png"/>
                     <pic:cNvPicPr preferRelativeResize="0"/>
                   </pic:nvPicPr>
                   <pic:blipFill>
@@ -8738,12 +8833,12 @@
           <wp:inline distB="114300" distT="114300" distL="114300" distR="114300">
             <wp:extent cx="3848100" cy="3419475"/>
             <wp:effectExtent b="0" l="0" r="0" t="0"/>
-            <wp:docPr id="5" name="image12.png"/>
+            <wp:docPr id="5" name="image5.png"/>
             <a:graphic>
               <a:graphicData uri="http://schemas.openxmlformats.org/drawingml/2006/picture">
                 <pic:pic>
                   <pic:nvPicPr>
-                    <pic:cNvPr id="0" name="image12.png"/>
+                    <pic:cNvPr id="0" name="image5.png"/>
                     <pic:cNvPicPr preferRelativeResize="0"/>
                   </pic:nvPicPr>
                   <pic:blipFill>
@@ -8974,7 +9069,7 @@
           <w:szCs w:val="24"/>
           <w:rtl w:val="0"/>
         </w:rPr>
-        <w:t xml:space="preserve">Python 3.8+</w:t>
+        <w:t xml:space="preserve">Python 3.10+</w:t>
       </w:r>
     </w:p>
     <w:p>
@@ -9464,7 +9559,46 @@
           <w:szCs w:val="24"/>
           <w:rtl w:val="0"/>
         </w:rPr>
-        <w:t xml:space="preserve">3. Traffic Network Model (`classes/Nodes/`, `classes/Edges/`)</w:t>
+        <w:t xml:space="preserve">3. Vehicle System (`classes/Entities/Vehicles/`)</w:t>
+      </w:r>
+    </w:p>
+    <w:p>
+      <w:pPr>
+        <w:numPr>
+          <w:ilvl w:val="0"/>
+          <w:numId w:val="16"/>
+        </w:numPr>
+        <w:spacing w:after="240" w:before="240" w:lineRule="auto"/>
+        <w:ind w:left="720" w:hanging="360"/>
+        <w:rPr>
+          <w:sz w:val="24"/>
+          <w:szCs w:val="24"/>
+        </w:rPr>
+      </w:pPr>
+      <w:r>
+        <w:rPr>
+          <w:sz w:val="24"/>
+          <w:szCs w:val="24"/>
+          <w:rtl w:val="0"/>
+        </w:rPr>
+        <w:t xml:space="preserve">Vehicle.py: General vehicle class (including types such as Car, Bus and Truck)</w:t>
+      </w:r>
+    </w:p>
+    <w:p>
+      <w:pPr>
+        <w:spacing w:after="240" w:before="240" w:lineRule="auto"/>
+        <w:rPr>
+          <w:sz w:val="24"/>
+          <w:szCs w:val="24"/>
+        </w:rPr>
+      </w:pPr>
+      <w:r>
+        <w:rPr>
+          <w:sz w:val="24"/>
+          <w:szCs w:val="24"/>
+          <w:rtl w:val="0"/>
+        </w:rPr>
+        <w:t xml:space="preserve">4. Traffic Network Model (`classes/Nodes/`, `classes/Edges/`)</w:t>
       </w:r>
     </w:p>
     <w:p>
@@ -9603,46 +9737,6 @@
           <w:rtl w:val="0"/>
         </w:rPr>
         <w:t xml:space="preserve">RoadLane.py: Lane-specific in road properties</w:t>
-      </w:r>
-    </w:p>
-    <w:p>
-      <w:pPr>
-        <w:spacing w:after="240" w:before="240" w:lineRule="auto"/>
-        <w:rPr>
-          <w:sz w:val="24"/>
-          <w:szCs w:val="24"/>
-        </w:rPr>
-      </w:pPr>
-      <w:r>
-        <w:rPr>
-          <w:sz w:val="24"/>
-          <w:szCs w:val="24"/>
-          <w:rtl w:val="0"/>
-        </w:rPr>
-        <w:t xml:space="preserve">4. Vehicle System (`classes/Entities/Vehicles/`)</w:t>
-      </w:r>
-    </w:p>
-    <w:p>
-      <w:pPr>
-        <w:numPr>
-          <w:ilvl w:val="0"/>
-          <w:numId w:val="16"/>
-        </w:numPr>
-        <w:spacing w:after="240" w:before="240" w:lineRule="auto"/>
-        <w:ind w:left="720" w:hanging="360"/>
-        <w:rPr>
-          <w:sz w:val="24"/>
-          <w:szCs w:val="24"/>
-          <w:u w:val="none"/>
-        </w:rPr>
-      </w:pPr>
-      <w:r>
-        <w:rPr>
-          <w:sz w:val="24"/>
-          <w:szCs w:val="24"/>
-          <w:rtl w:val="0"/>
-        </w:rPr>
-        <w:t xml:space="preserve">Vehicle.py: General vehicle class</w:t>
       </w:r>
     </w:p>
     <w:p>

</xml_diff>